<commit_message>
Generate reference baselines from exhibition history
</commit_message>
<xml_diff>
--- a/output/report-draft.docx
+++ b/output/report-draft.docx
@@ -392,7 +392,7 @@
               <w:pStyle w:val="TableText"/>
             </w:pPr>
             <w:r>
-              <w:t xml:space="preserve">기존 기획전 평균 9,413명 대비 상회</w:t>
+              <w:t xml:space="preserve">정기 기획전 평균 9,538명 대비 상회</w:t>
             </w:r>
           </w:p>
         </w:tc>
@@ -433,7 +433,7 @@
               <w:pStyle w:val="TableText"/>
             </w:pPr>
             <w:r>
-              <w:t xml:space="preserve">기존 기획전 평균 159.7명 대비 상회</w:t>
+              <w:t xml:space="preserve">정기 기획전 평균 158.4명 대비 상회</w:t>
             </w:r>
           </w:p>
         </w:tc>
@@ -474,7 +474,7 @@
               <w:pStyle w:val="TableText"/>
             </w:pPr>
             <w:r>
-              <w:t xml:space="preserve">기존 기획전 평균 140,000,000원 대비 상회</w:t>
+              <w:t xml:space="preserve">정기 기획전 평균 140,000,000원 대비 상회</w:t>
             </w:r>
           </w:p>
         </w:tc>
@@ -556,7 +556,7 @@
               <w:pStyle w:val="TableText"/>
             </w:pPr>
             <w:r>
-              <w:t xml:space="preserve">기존 기획전 평균 807.6명 대비 하회</w:t>
+              <w:t xml:space="preserve">정기 기획전 평균 806명 대비 하회</w:t>
             </w:r>
           </w:p>
         </w:tc>
@@ -597,7 +597,7 @@
               <w:pStyle w:val="TableText"/>
             </w:pPr>
             <w:r>
-              <w:t xml:space="preserve">기존 기획전 평균 28.9건 대비 상회</w:t>
+              <w:t xml:space="preserve">정기 기획전 평균 29건 대비 상회</w:t>
             </w:r>
           </w:p>
         </w:tc>
@@ -624,7 +624,7 @@
         <w:pStyle w:val="Bullet"/>
       </w:pPr>
       <w:r>
-        <w:t xml:space="preserve">• 총 관객 수 15,200명, 일평균 230명으로 기존 기획전 평균 대비 높은 관객 규모가 확인됨.</w:t>
+        <w:t xml:space="preserve">• 총 관객 수 15,200명, 일평균 230명으로 정기 기획전 평균 대비 높은 관객 규모가 확인됨.</w:t>
       </w:r>
     </w:p>
     <w:p>
@@ -632,7 +632,7 @@
         <w:pStyle w:val="Caveat"/>
       </w:pPr>
       <w:r>
-        <w:t xml:space="preserve">한계: 샘플 데이터 기반 비교군이며 실제 전시군 분류는 운영 목적에 맞게 재정의해야 합니다. 성과 판정이 아니라 수치상 특이점으로 기록합니다.</w:t>
+        <w:t xml:space="preserve">한계: 기존 전시 원자료의 유형 분류와 입력된 수치를 바탕으로 자동 산출한 비교군입니다. 성과 판정이 아니라 수치상 특이점으로 기록합니다.</w:t>
       </w:r>
     </w:p>
     <w:p>
@@ -640,7 +640,7 @@
         <w:pStyle w:val="Bullet"/>
       </w:pPr>
       <w:r>
-        <w:t xml:space="preserve">• 총 사용 예산은 높은 편이나, 관객당 비용은 13,816원/명으로 기존 기획전 기준값과 비교해 검토할 수 있음.</w:t>
+        <w:t xml:space="preserve">• 유료 관객 비율은 58.6%로 정기 기획전 평균과 차이를 보이며, 관객 확대와 수입 구조를 분리해 검토할 필요가 있음.</w:t>
       </w:r>
     </w:p>
     <w:p>
@@ -648,15 +648,95 @@
         <w:pStyle w:val="Caveat"/>
       </w:pPr>
       <w:r>
+        <w:t xml:space="preserve">한계: 초대, 제휴, 패스, 단체 관람 정책의 영향을 함께 확인해야 하며 수입 성과와 단순히 동일시할 수 없습니다.</w:t>
+      </w:r>
+    </w:p>
+    <w:p>
+      <w:pPr>
+        <w:pStyle w:val="Bullet"/>
+      </w:pPr>
+      <w:r>
+        <w:t xml:space="preserve">• 프로그램 8개 65회차가 운영되었고, 참여 인원은 548명으로 비교 기준 대비 낮은 수준임.</w:t>
+      </w:r>
+    </w:p>
+    <w:p>
+      <w:pPr>
+        <w:pStyle w:val="Caveat"/>
+      </w:pPr>
+      <w:r>
+        <w:t xml:space="preserve">한계: 프로그램 유형, 정원, 사전예약 방식이 다르면 단순 참여 인원 비교의 의미가 제한됩니다.</w:t>
+      </w:r>
+    </w:p>
+    <w:p>
+      <w:pPr>
+        <w:pStyle w:val="Bullet"/>
+      </w:pPr>
+      <w:r>
+        <w:t xml:space="preserve">• 선별된 부정 및 건의 반응에서는 혼잡도와 감상 동선에 관한 의견이 확인됨.</w:t>
+      </w:r>
+    </w:p>
+    <w:p>
+      <w:pPr>
+        <w:pStyle w:val="Caveat"/>
+      </w:pPr>
+      <w:r>
+        <w:t xml:space="preserve">한계: 아래 반응은 전체 관객 의견의 통계적 표본이 아니라 보고서 작성자가 선별 입력한 후기입니다.</w:t>
+      </w:r>
+    </w:p>
+    <w:p>
+      <w:pPr>
+        <w:pStyle w:val="Bullet"/>
+      </w:pPr>
+      <w:r>
+        <w:t xml:space="preserve">• 총 사용 예산은 높은 편이나, 관객당 비용은 13,816원/명으로 정기 기획전 기준값과 비교해 검토할 수 있음.</w:t>
+      </w:r>
+    </w:p>
+    <w:p>
+      <w:pPr>
+        <w:pStyle w:val="Caveat"/>
+      </w:pPr>
+      <w:r>
         <w:t xml:space="preserve">한계: 관객당 비용은 예산 총액과 관객 수만 반영하므로 전시의 질적 완성도나 제작 난이도를 직접 평가하지 않습니다.</w:t>
       </w:r>
     </w:p>
     <w:p>
       <w:pPr>
-        <w:pStyle w:val="Bullet"/>
-      </w:pPr>
-      <w:r>
-        <w:t xml:space="preserve">• 유료 관객 비율은 58.6%로 기존 기획전 평균과 차이를 보이며, 관객 확대와 수입 구조를 분리해 검토할 필요가 있음.</w:t>
+        <w:pStyle w:val="Heading1"/>
+      </w:pPr>
+      <w:r>
+        <w:t xml:space="preserve">IV. 세부 관찰</w:t>
+      </w:r>
+    </w:p>
+    <w:p>
+      <w:pPr>
+        <w:pStyle w:val="Heading2"/>
+      </w:pPr>
+      <w:r>
+        <w:t xml:space="preserve">1. 전시 구성</w:t>
+      </w:r>
+    </w:p>
+    <w:p>
+      <w:pPr>
+        <w:pStyle w:val="BodyText"/>
+      </w:pPr>
+      <w:r>
+        <w:t xml:space="preserve">전시 구성 항목에는 전시실별 구성·작품 수·공간 연출·연계 프로그램 운영 내역을 입력합니다. 현재 샘플은 프로그램 참여 지표를 중심으로 구성됩니다.</w:t>
+      </w:r>
+    </w:p>
+    <w:p>
+      <w:pPr>
+        <w:pStyle w:val="Heading2"/>
+      </w:pPr>
+      <w:r>
+        <w:t xml:space="preserve">프로그램 참여 인원은 정기 기획전 평균을 하회함</w:t>
+      </w:r>
+    </w:p>
+    <w:p>
+      <w:pPr>
+        <w:pStyle w:val="BodyText"/>
+      </w:pPr>
+      <w:r>
+        <w:t xml:space="preserve">프로그램 8개 65회차가 운영되었고, 참여 인원은 548명으로 비교 기준 대비 낮은 수준임.</w:t>
       </w:r>
     </w:p>
     <w:p>
@@ -664,15 +744,279 @@
         <w:pStyle w:val="Caveat"/>
       </w:pPr>
       <w:r>
+        <w:t xml:space="preserve">한계: 프로그램 유형, 정원, 사전예약 방식이 다르면 단순 참여 인원 비교의 의미가 제한됩니다.</w:t>
+      </w:r>
+    </w:p>
+    <w:p>
+      <w:pPr>
+        <w:pStyle w:val="EvidenceLabel"/>
+      </w:pPr>
+      <w:r>
+        <w:t xml:space="preserve">근거</w:t>
+      </w:r>
+    </w:p>
+    <w:p>
+      <w:pPr>
+        <w:pStyle w:val="Evidence"/>
+      </w:pPr>
+      <w:r>
+        <w:t xml:space="preserve">• 프로그램 참여 인원: 548명</w:t>
+      </w:r>
+    </w:p>
+    <w:p>
+      <w:pPr>
+        <w:pStyle w:val="Evidence"/>
+      </w:pPr>
+      <w:r>
+        <w:t xml:space="preserve">• 정기 기획전 평균: 806명</w:t>
+      </w:r>
+    </w:p>
+    <w:p>
+      <w:pPr>
+        <w:pStyle w:val="Evidence"/>
+      </w:pPr>
+      <w:r>
+        <w:t xml:space="preserve">• 프로그램 참여율: 3.6%</w:t>
+      </w:r>
+    </w:p>
+    <w:p>
+      <w:pPr>
+        <w:pStyle w:val="Evidence"/>
+      </w:pPr>
+      <w:r>
+        <w:t xml:space="preserve">• 평균 대비 차이: -32%</w:t>
+      </w:r>
+    </w:p>
+    <w:p>
+      <w:pPr>
+        <w:pStyle w:val="Heading2"/>
+      </w:pPr>
+      <w:r>
+        <w:t xml:space="preserve">2. 전시 결과</w:t>
+      </w:r>
+    </w:p>
+    <w:p>
+      <w:pPr>
+        <w:pStyle w:val="Heading2"/>
+      </w:pPr>
+      <w:r>
+        <w:t xml:space="preserve">총 관객 수와 일평균 관객 수가 정기 기획전 평균을 상회함</w:t>
+      </w:r>
+    </w:p>
+    <w:p>
+      <w:pPr>
+        <w:pStyle w:val="BodyText"/>
+      </w:pPr>
+      <w:r>
+        <w:t xml:space="preserve">총 관객 수 15,200명, 일평균 230명으로 정기 기획전 평균 대비 높은 관객 규모가 확인됨.</w:t>
+      </w:r>
+    </w:p>
+    <w:p>
+      <w:pPr>
+        <w:pStyle w:val="Caveat"/>
+      </w:pPr>
+      <w:r>
+        <w:t xml:space="preserve">한계: 기존 전시 원자료의 유형 분류와 입력된 수치를 바탕으로 자동 산출한 비교군입니다. 성과 판정이 아니라 수치상 특이점으로 기록합니다.</w:t>
+      </w:r>
+    </w:p>
+    <w:p>
+      <w:pPr>
+        <w:pStyle w:val="EvidenceLabel"/>
+      </w:pPr>
+      <w:r>
+        <w:t xml:space="preserve">근거</w:t>
+      </w:r>
+    </w:p>
+    <w:p>
+      <w:pPr>
+        <w:pStyle w:val="Evidence"/>
+      </w:pPr>
+      <w:r>
+        <w:t xml:space="preserve">• 총 관객 수: 15,200명</w:t>
+      </w:r>
+    </w:p>
+    <w:p>
+      <w:pPr>
+        <w:pStyle w:val="Evidence"/>
+      </w:pPr>
+      <w:r>
+        <w:t xml:space="preserve">• 정기 기획전 평균: 9,538명</w:t>
+      </w:r>
+    </w:p>
+    <w:p>
+      <w:pPr>
+        <w:pStyle w:val="Evidence"/>
+      </w:pPr>
+      <w:r>
+        <w:t xml:space="preserve">• 평균 대비 차이: +59.4%</w:t>
+      </w:r>
+    </w:p>
+    <w:p>
+      <w:pPr>
+        <w:pStyle w:val="Evidence"/>
+      </w:pPr>
+      <w:r>
+        <w:t xml:space="preserve">• 일평균 관객: 230명</w:t>
+      </w:r>
+    </w:p>
+    <w:p>
+      <w:pPr>
+        <w:pStyle w:val="Evidence"/>
+      </w:pPr>
+      <w:r>
+        <w:t xml:space="preserve">• 일평균 기준값: 158.4명</w:t>
+      </w:r>
+    </w:p>
+    <w:p>
+      <w:pPr>
+        <w:pStyle w:val="Heading2"/>
+      </w:pPr>
+      <w:r>
+        <w:t xml:space="preserve">관객당 비용이 비교 기준 대비 산출됨</w:t>
+      </w:r>
+    </w:p>
+    <w:p>
+      <w:pPr>
+        <w:pStyle w:val="BodyText"/>
+      </w:pPr>
+      <w:r>
+        <w:t xml:space="preserve">총 사용 예산은 높은 편이나, 관객당 비용은 13,816원/명으로 정기 기획전 기준값과 비교해 검토할 수 있음.</w:t>
+      </w:r>
+    </w:p>
+    <w:p>
+      <w:pPr>
+        <w:pStyle w:val="Caveat"/>
+      </w:pPr>
+      <w:r>
+        <w:t xml:space="preserve">한계: 관객당 비용은 예산 총액과 관객 수만 반영하므로 전시의 질적 완성도나 제작 난이도를 직접 평가하지 않습니다.</w:t>
+      </w:r>
+    </w:p>
+    <w:p>
+      <w:pPr>
+        <w:pStyle w:val="EvidenceLabel"/>
+      </w:pPr>
+      <w:r>
+        <w:t xml:space="preserve">근거</w:t>
+      </w:r>
+    </w:p>
+    <w:p>
+      <w:pPr>
+        <w:pStyle w:val="Evidence"/>
+      </w:pPr>
+      <w:r>
+        <w:t xml:space="preserve">• 총 사용 예산: 210,000,000원</w:t>
+      </w:r>
+    </w:p>
+    <w:p>
+      <w:pPr>
+        <w:pStyle w:val="Evidence"/>
+      </w:pPr>
+      <w:r>
+        <w:t xml:space="preserve">• 총 관객 수: 15,200명</w:t>
+      </w:r>
+    </w:p>
+    <w:p>
+      <w:pPr>
+        <w:pStyle w:val="Evidence"/>
+      </w:pPr>
+      <w:r>
+        <w:t xml:space="preserve">• 관객당 비용: 13,816원/명</w:t>
+      </w:r>
+    </w:p>
+    <w:p>
+      <w:pPr>
+        <w:pStyle w:val="Evidence"/>
+      </w:pPr>
+      <w:r>
+        <w:t xml:space="preserve">• 정기 기획전 기준값: 14,719원/명</w:t>
+      </w:r>
+    </w:p>
+    <w:p>
+      <w:pPr>
+        <w:pStyle w:val="Heading2"/>
+      </w:pPr>
+      <w:r>
+        <w:t xml:space="preserve">유료 관객 비율은 정기 기획전 평균보다 낮게 나타남</w:t>
+      </w:r>
+    </w:p>
+    <w:p>
+      <w:pPr>
+        <w:pStyle w:val="BodyText"/>
+      </w:pPr>
+      <w:r>
+        <w:t xml:space="preserve">유료 관객 비율은 58.6%로 정기 기획전 평균과 차이를 보이며, 관객 확대와 수입 구조를 분리해 검토할 필요가 있음.</w:t>
+      </w:r>
+    </w:p>
+    <w:p>
+      <w:pPr>
+        <w:pStyle w:val="Caveat"/>
+      </w:pPr>
+      <w:r>
         <w:t xml:space="preserve">한계: 초대, 제휴, 패스, 단체 관람 정책의 영향을 함께 확인해야 하며 수입 성과와 단순히 동일시할 수 없습니다.</w:t>
       </w:r>
     </w:p>
     <w:p>
       <w:pPr>
-        <w:pStyle w:val="Bullet"/>
-      </w:pPr>
-      <w:r>
-        <w:t xml:space="preserve">• 프로그램 8개 65회차가 운영되었고, 참여 인원은 548명으로 비교 기준 대비 낮은 수준임.</w:t>
+        <w:pStyle w:val="EvidenceLabel"/>
+      </w:pPr>
+      <w:r>
+        <w:t xml:space="preserve">근거</w:t>
+      </w:r>
+    </w:p>
+    <w:p>
+      <w:pPr>
+        <w:pStyle w:val="Evidence"/>
+      </w:pPr>
+      <w:r>
+        <w:t xml:space="preserve">• 유료 관객 비율: 58.6%</w:t>
+      </w:r>
+    </w:p>
+    <w:p>
+      <w:pPr>
+        <w:pStyle w:val="Evidence"/>
+      </w:pPr>
+      <w:r>
+        <w:t xml:space="preserve">• 정기 기획전 평균: 86.2%</w:t>
+      </w:r>
+    </w:p>
+    <w:p>
+      <w:pPr>
+        <w:pStyle w:val="Evidence"/>
+      </w:pPr>
+      <w:r>
+        <w:t xml:space="preserve">• 차이: -27.6%p</w:t>
+      </w:r>
+    </w:p>
+    <w:p>
+      <w:pPr>
+        <w:pStyle w:val="Evidence"/>
+      </w:pPr>
+      <w:r>
+        <w:t xml:space="preserve">• 유료 관객 수: 8,907명</w:t>
+      </w:r>
+    </w:p>
+    <w:p>
+      <w:pPr>
+        <w:pStyle w:val="Heading2"/>
+      </w:pPr>
+      <w:r>
+        <w:t xml:space="preserve">3. 홍보 및 언론</w:t>
+      </w:r>
+    </w:p>
+    <w:p>
+      <w:pPr>
+        <w:pStyle w:val="Heading2"/>
+      </w:pPr>
+      <w:r>
+        <w:t xml:space="preserve">언론 보도와 자체 채널 지표는 관객 유입 가능성과 함께 참고할 만함</w:t>
+      </w:r>
+    </w:p>
+    <w:p>
+      <w:pPr>
+        <w:pStyle w:val="BodyText"/>
+      </w:pPr>
+      <w:r>
+        <w:t xml:space="preserve">언론 보도 32건과 SNS 게시 24건은 관객 유입과의 직접 인과가 아니라 홍보 활동의 참고 지표로 다루는 것이 적절함.</w:t>
       </w:r>
     </w:p>
     <w:p>
@@ -680,71 +1024,7 @@
         <w:pStyle w:val="Caveat"/>
       </w:pPr>
       <w:r>
-        <w:t xml:space="preserve">한계: 프로그램 유형, 정원, 사전예약 방식이 다르면 단순 참여 인원 비교의 의미가 제한됩니다.</w:t>
-      </w:r>
-    </w:p>
-    <w:p>
-      <w:pPr>
-        <w:pStyle w:val="Bullet"/>
-      </w:pPr>
-      <w:r>
-        <w:t xml:space="preserve">• 선별된 부정 및 건의 반응에서는 혼잡도와 감상 동선에 관한 의견이 확인됨.</w:t>
-      </w:r>
-    </w:p>
-    <w:p>
-      <w:pPr>
-        <w:pStyle w:val="Caveat"/>
-      </w:pPr>
-      <w:r>
-        <w:t xml:space="preserve">한계: 아래 반응은 전체 관객 의견의 통계적 표본이 아니라 보고서 작성자가 선별 입력한 후기입니다.</w:t>
-      </w:r>
-    </w:p>
-    <w:p>
-      <w:pPr>
-        <w:pStyle w:val="Heading1"/>
-      </w:pPr>
-      <w:r>
-        <w:t xml:space="preserve">IV. 세부 관찰</w:t>
-      </w:r>
-    </w:p>
-    <w:p>
-      <w:pPr>
-        <w:pStyle w:val="Heading2"/>
-      </w:pPr>
-      <w:r>
-        <w:t xml:space="preserve">1. 전시 구성</w:t>
-      </w:r>
-    </w:p>
-    <w:p>
-      <w:pPr>
-        <w:pStyle w:val="BodyText"/>
-      </w:pPr>
-      <w:r>
-        <w:t xml:space="preserve">전시 구성 항목에는 전시실별 구성·작품 수·공간 연출·연계 프로그램 운영 내역을 입력합니다. 현재 샘플은 프로그램 참여 지표를 중심으로 구성됩니다.</w:t>
-      </w:r>
-    </w:p>
-    <w:p>
-      <w:pPr>
-        <w:pStyle w:val="Heading2"/>
-      </w:pPr>
-      <w:r>
-        <w:t xml:space="preserve">프로그램 참여 인원은 기존 기획전 평균을 하회함</w:t>
-      </w:r>
-    </w:p>
-    <w:p>
-      <w:pPr>
-        <w:pStyle w:val="BodyText"/>
-      </w:pPr>
-      <w:r>
-        <w:t xml:space="preserve">프로그램 8개 65회차가 운영되었고, 참여 인원은 548명으로 비교 기준 대비 낮은 수준임.</w:t>
-      </w:r>
-    </w:p>
-    <w:p>
-      <w:pPr>
-        <w:pStyle w:val="Caveat"/>
-      </w:pPr>
-      <w:r>
-        <w:t xml:space="preserve">한계: 프로그램 유형, 정원, 사전예약 방식이 다르면 단순 참여 인원 비교의 의미가 제한됩니다.</w:t>
+        <w:t xml:space="preserve">한계: 언론 보도 건수와 SNS 게시 수만으로 관객 유입의 인과관계를 확정할 수 없습니다.</w:t>
       </w:r>
     </w:p>
     <w:p>
@@ -760,286 +1040,6 @@
         <w:pStyle w:val="Evidence"/>
       </w:pPr>
       <w:r>
-        <w:t xml:space="preserve">• 프로그램 참여 인원: 548명</w:t>
-      </w:r>
-    </w:p>
-    <w:p>
-      <w:pPr>
-        <w:pStyle w:val="Evidence"/>
-      </w:pPr>
-      <w:r>
-        <w:t xml:space="preserve">• 기존 기획전 평균: 807.6명</w:t>
-      </w:r>
-    </w:p>
-    <w:p>
-      <w:pPr>
-        <w:pStyle w:val="Evidence"/>
-      </w:pPr>
-      <w:r>
-        <w:t xml:space="preserve">• 프로그램 참여율: 3.6%</w:t>
-      </w:r>
-    </w:p>
-    <w:p>
-      <w:pPr>
-        <w:pStyle w:val="Evidence"/>
-      </w:pPr>
-      <w:r>
-        <w:t xml:space="preserve">• 평균 대비 차이: -32.1%</w:t>
-      </w:r>
-    </w:p>
-    <w:p>
-      <w:pPr>
-        <w:pStyle w:val="Heading2"/>
-      </w:pPr>
-      <w:r>
-        <w:t xml:space="preserve">2. 전시 결과</w:t>
-      </w:r>
-    </w:p>
-    <w:p>
-      <w:pPr>
-        <w:pStyle w:val="Heading2"/>
-      </w:pPr>
-      <w:r>
-        <w:t xml:space="preserve">총 관객 수와 일평균 관객 수가 기존 기획전 평균을 상회함</w:t>
-      </w:r>
-    </w:p>
-    <w:p>
-      <w:pPr>
-        <w:pStyle w:val="BodyText"/>
-      </w:pPr>
-      <w:r>
-        <w:t xml:space="preserve">총 관객 수 15,200명, 일평균 230명으로 기존 기획전 평균 대비 높은 관객 규모가 확인됨.</w:t>
-      </w:r>
-    </w:p>
-    <w:p>
-      <w:pPr>
-        <w:pStyle w:val="Caveat"/>
-      </w:pPr>
-      <w:r>
-        <w:t xml:space="preserve">한계: 샘플 데이터 기반 비교군이며 실제 전시군 분류는 운영 목적에 맞게 재정의해야 합니다. 성과 판정이 아니라 수치상 특이점으로 기록합니다.</w:t>
-      </w:r>
-    </w:p>
-    <w:p>
-      <w:pPr>
-        <w:pStyle w:val="EvidenceLabel"/>
-      </w:pPr>
-      <w:r>
-        <w:t xml:space="preserve">근거</w:t>
-      </w:r>
-    </w:p>
-    <w:p>
-      <w:pPr>
-        <w:pStyle w:val="Evidence"/>
-      </w:pPr>
-      <w:r>
-        <w:t xml:space="preserve">• 총 관객 수: 15,200명</w:t>
-      </w:r>
-    </w:p>
-    <w:p>
-      <w:pPr>
-        <w:pStyle w:val="Evidence"/>
-      </w:pPr>
-      <w:r>
-        <w:t xml:space="preserve">• 기존 기획전 평균: 9,413명</w:t>
-      </w:r>
-    </w:p>
-    <w:p>
-      <w:pPr>
-        <w:pStyle w:val="Evidence"/>
-      </w:pPr>
-      <w:r>
-        <w:t xml:space="preserve">• 평균 대비 차이: +61.5%</w:t>
-      </w:r>
-    </w:p>
-    <w:p>
-      <w:pPr>
-        <w:pStyle w:val="Evidence"/>
-      </w:pPr>
-      <w:r>
-        <w:t xml:space="preserve">• 일평균 관객: 230명</w:t>
-      </w:r>
-    </w:p>
-    <w:p>
-      <w:pPr>
-        <w:pStyle w:val="Evidence"/>
-      </w:pPr>
-      <w:r>
-        <w:t xml:space="preserve">• 일평균 기준값: 159.7명</w:t>
-      </w:r>
-    </w:p>
-    <w:p>
-      <w:pPr>
-        <w:pStyle w:val="Heading2"/>
-      </w:pPr>
-      <w:r>
-        <w:t xml:space="preserve">관객당 비용이 비교 기준 대비 산출됨</w:t>
-      </w:r>
-    </w:p>
-    <w:p>
-      <w:pPr>
-        <w:pStyle w:val="BodyText"/>
-      </w:pPr>
-      <w:r>
-        <w:t xml:space="preserve">총 사용 예산은 높은 편이나, 관객당 비용은 13,816원/명으로 기존 기획전 기준값과 비교해 검토할 수 있음.</w:t>
-      </w:r>
-    </w:p>
-    <w:p>
-      <w:pPr>
-        <w:pStyle w:val="Caveat"/>
-      </w:pPr>
-      <w:r>
-        <w:t xml:space="preserve">한계: 관객당 비용은 예산 총액과 관객 수만 반영하므로 전시의 질적 완성도나 제작 난이도를 직접 평가하지 않습니다.</w:t>
-      </w:r>
-    </w:p>
-    <w:p>
-      <w:pPr>
-        <w:pStyle w:val="EvidenceLabel"/>
-      </w:pPr>
-      <w:r>
-        <w:t xml:space="preserve">근거</w:t>
-      </w:r>
-    </w:p>
-    <w:p>
-      <w:pPr>
-        <w:pStyle w:val="Evidence"/>
-      </w:pPr>
-      <w:r>
-        <w:t xml:space="preserve">• 총 사용 예산: 210,000,000원</w:t>
-      </w:r>
-    </w:p>
-    <w:p>
-      <w:pPr>
-        <w:pStyle w:val="Evidence"/>
-      </w:pPr>
-      <w:r>
-        <w:t xml:space="preserve">• 총 관객 수: 15,200명</w:t>
-      </w:r>
-    </w:p>
-    <w:p>
-      <w:pPr>
-        <w:pStyle w:val="Evidence"/>
-      </w:pPr>
-      <w:r>
-        <w:t xml:space="preserve">• 관객당 비용: 13,816원/명</w:t>
-      </w:r>
-    </w:p>
-    <w:p>
-      <w:pPr>
-        <w:pStyle w:val="Evidence"/>
-      </w:pPr>
-      <w:r>
-        <w:t xml:space="preserve">• 기존 기획전 기준값: 20,000원/명</w:t>
-      </w:r>
-    </w:p>
-    <w:p>
-      <w:pPr>
-        <w:pStyle w:val="Heading2"/>
-      </w:pPr>
-      <w:r>
-        <w:t xml:space="preserve">유료 관객 비율은 기존 기획전 평균보다 낮게 나타남</w:t>
-      </w:r>
-    </w:p>
-    <w:p>
-      <w:pPr>
-        <w:pStyle w:val="BodyText"/>
-      </w:pPr>
-      <w:r>
-        <w:t xml:space="preserve">유료 관객 비율은 58.6%로 기존 기획전 평균과 차이를 보이며, 관객 확대와 수입 구조를 분리해 검토할 필요가 있음.</w:t>
-      </w:r>
-    </w:p>
-    <w:p>
-      <w:pPr>
-        <w:pStyle w:val="Caveat"/>
-      </w:pPr>
-      <w:r>
-        <w:t xml:space="preserve">한계: 초대, 제휴, 패스, 단체 관람 정책의 영향을 함께 확인해야 하며 수입 성과와 단순히 동일시할 수 없습니다.</w:t>
-      </w:r>
-    </w:p>
-    <w:p>
-      <w:pPr>
-        <w:pStyle w:val="EvidenceLabel"/>
-      </w:pPr>
-      <w:r>
-        <w:t xml:space="preserve">근거</w:t>
-      </w:r>
-    </w:p>
-    <w:p>
-      <w:pPr>
-        <w:pStyle w:val="Evidence"/>
-      </w:pPr>
-      <w:r>
-        <w:t xml:space="preserve">• 유료 관객 비율: 58.6%</w:t>
-      </w:r>
-    </w:p>
-    <w:p>
-      <w:pPr>
-        <w:pStyle w:val="Evidence"/>
-      </w:pPr>
-      <w:r>
-        <w:t xml:space="preserve">• 기존 기획전 평균: 86.6%</w:t>
-      </w:r>
-    </w:p>
-    <w:p>
-      <w:pPr>
-        <w:pStyle w:val="Evidence"/>
-      </w:pPr>
-      <w:r>
-        <w:t xml:space="preserve">• 차이: -28%p</w:t>
-      </w:r>
-    </w:p>
-    <w:p>
-      <w:pPr>
-        <w:pStyle w:val="Evidence"/>
-      </w:pPr>
-      <w:r>
-        <w:t xml:space="preserve">• 유료 관객 수: 8,907명</w:t>
-      </w:r>
-    </w:p>
-    <w:p>
-      <w:pPr>
-        <w:pStyle w:val="Heading2"/>
-      </w:pPr>
-      <w:r>
-        <w:t xml:space="preserve">3. 홍보 및 언론</w:t>
-      </w:r>
-    </w:p>
-    <w:p>
-      <w:pPr>
-        <w:pStyle w:val="Heading2"/>
-      </w:pPr>
-      <w:r>
-        <w:t xml:space="preserve">언론 보도와 자체 채널 지표는 관객 유입 가능성과 함께 참고할 만함</w:t>
-      </w:r>
-    </w:p>
-    <w:p>
-      <w:pPr>
-        <w:pStyle w:val="BodyText"/>
-      </w:pPr>
-      <w:r>
-        <w:t xml:space="preserve">언론 보도 32건과 SNS 게시 24건은 관객 유입과의 직접 인과가 아니라 홍보 활동의 참고 지표로 다루는 것이 적절함.</w:t>
-      </w:r>
-    </w:p>
-    <w:p>
-      <w:pPr>
-        <w:pStyle w:val="Caveat"/>
-      </w:pPr>
-      <w:r>
-        <w:t xml:space="preserve">한계: 언론 보도 건수와 SNS 게시 수만으로 관객 유입의 인과관계를 확정할 수 없습니다.</w:t>
-      </w:r>
-    </w:p>
-    <w:p>
-      <w:pPr>
-        <w:pStyle w:val="EvidenceLabel"/>
-      </w:pPr>
-      <w:r>
-        <w:t xml:space="preserve">근거</w:t>
-      </w:r>
-    </w:p>
-    <w:p>
-      <w:pPr>
-        <w:pStyle w:val="Evidence"/>
-      </w:pPr>
-      <w:r>
         <w:t xml:space="preserve">• 언론 보도 건수: 32건</w:t>
       </w:r>
     </w:p>
@@ -1056,7 +1056,7 @@
         <w:pStyle w:val="Evidence"/>
       </w:pPr>
       <w:r>
-        <w:t xml:space="preserve">• 기존 기획전 보도 평균: 28.9건</w:t>
+        <w:t xml:space="preserve">• 정기 기획전 보도 평균: 29건</w:t>
       </w:r>
     </w:p>
     <w:p>

</xml_diff>

<commit_message>
Select fixed and recommended director metrics
</commit_message>
<xml_diff>
--- a/output/report-draft.docx
+++ b/output/report-draft.docx
@@ -489,33 +489,33 @@
               <w:pStyle w:val="TableText"/>
             </w:pPr>
             <w:r>
-              <w:t xml:space="preserve">관객당 비용</w:t>
-            </w:r>
-          </w:p>
-        </w:tc>
-        <w:tc>
-          <w:tcPr>
-            <w:tcW w:w="3000" w:type="dxa"/>
-          </w:tcPr>
-          <w:p>
-            <w:pPr>
-              <w:pStyle w:val="TableText"/>
-            </w:pPr>
-            <w:r>
-              <w:t xml:space="preserve">13,816원/명</w:t>
-            </w:r>
-          </w:p>
-        </w:tc>
-        <w:tc>
-          <w:tcPr>
-            <w:tcW w:w="3000" w:type="dxa"/>
-          </w:tcPr>
-          <w:p>
-            <w:pPr>
-              <w:pStyle w:val="TableText"/>
-            </w:pPr>
-            <w:r>
-              <w:t xml:space="preserve">총 사용 예산 / 총 관객 수</w:t>
+              <w:t xml:space="preserve">총 수입</w:t>
+            </w:r>
+          </w:p>
+        </w:tc>
+        <w:tc>
+          <w:tcPr>
+            <w:tcW w:w="3000" w:type="dxa"/>
+          </w:tcPr>
+          <w:p>
+            <w:pPr>
+              <w:pStyle w:val="TableText"/>
+            </w:pPr>
+            <w:r>
+              <w:t xml:space="preserve">35,600,000원</w:t>
+            </w:r>
+          </w:p>
+        </w:tc>
+        <w:tc>
+          <w:tcPr>
+            <w:tcW w:w="3000" w:type="dxa"/>
+          </w:tcPr>
+          <w:p>
+            <w:pPr>
+              <w:pStyle w:val="TableText"/>
+            </w:pPr>
+            <w:r>
+              <w:t xml:space="preserve">정기 기획전 평균 29,375,000원 대비 상회</w:t>
             </w:r>
           </w:p>
         </w:tc>
@@ -530,33 +530,33 @@
               <w:pStyle w:val="TableText"/>
             </w:pPr>
             <w:r>
-              <w:t xml:space="preserve">프로그램 참여 인원</w:t>
-            </w:r>
-          </w:p>
-        </w:tc>
-        <w:tc>
-          <w:tcPr>
-            <w:tcW w:w="3000" w:type="dxa"/>
-          </w:tcPr>
-          <w:p>
-            <w:pPr>
-              <w:pStyle w:val="TableText"/>
-            </w:pPr>
-            <w:r>
-              <w:t xml:space="preserve">548명</w:t>
-            </w:r>
-          </w:p>
-        </w:tc>
-        <w:tc>
-          <w:tcPr>
-            <w:tcW w:w="3000" w:type="dxa"/>
-          </w:tcPr>
-          <w:p>
-            <w:pPr>
-              <w:pStyle w:val="TableText"/>
-            </w:pPr>
-            <w:r>
-              <w:t xml:space="preserve">정기 기획전 평균 806명 대비 하회</w:t>
+              <w:t xml:space="preserve">관객당 비용</w:t>
+            </w:r>
+          </w:p>
+        </w:tc>
+        <w:tc>
+          <w:tcPr>
+            <w:tcW w:w="3000" w:type="dxa"/>
+          </w:tcPr>
+          <w:p>
+            <w:pPr>
+              <w:pStyle w:val="TableText"/>
+            </w:pPr>
+            <w:r>
+              <w:t xml:space="preserve">13,816원/명</w:t>
+            </w:r>
+          </w:p>
+        </w:tc>
+        <w:tc>
+          <w:tcPr>
+            <w:tcW w:w="3000" w:type="dxa"/>
+          </w:tcPr>
+          <w:p>
+            <w:pPr>
+              <w:pStyle w:val="TableText"/>
+            </w:pPr>
+            <w:r>
+              <w:t xml:space="preserve">총 사용 예산 / 총 관객 수; 정기 기획전 평균 14,719원/명 대비 하회</w:t>
             </w:r>
           </w:p>
         </w:tc>
@@ -571,33 +571,33 @@
               <w:pStyle w:val="TableText"/>
             </w:pPr>
             <w:r>
-              <w:t xml:space="preserve">언론 보도 건수</w:t>
-            </w:r>
-          </w:p>
-        </w:tc>
-        <w:tc>
-          <w:tcPr>
-            <w:tcW w:w="3000" w:type="dxa"/>
-          </w:tcPr>
-          <w:p>
-            <w:pPr>
-              <w:pStyle w:val="TableText"/>
-            </w:pPr>
-            <w:r>
-              <w:t xml:space="preserve">32건</w:t>
-            </w:r>
-          </w:p>
-        </w:tc>
-        <w:tc>
-          <w:tcPr>
-            <w:tcW w:w="3000" w:type="dxa"/>
-          </w:tcPr>
-          <w:p>
-            <w:pPr>
-              <w:pStyle w:val="TableText"/>
-            </w:pPr>
-            <w:r>
-              <w:t xml:space="preserve">정기 기획전 평균 29건 대비 상회</w:t>
+              <w:t xml:space="preserve">프로그램 참여 인원</w:t>
+            </w:r>
+          </w:p>
+        </w:tc>
+        <w:tc>
+          <w:tcPr>
+            <w:tcW w:w="3000" w:type="dxa"/>
+          </w:tcPr>
+          <w:p>
+            <w:pPr>
+              <w:pStyle w:val="TableText"/>
+            </w:pPr>
+            <w:r>
+              <w:t xml:space="preserve">548명</w:t>
+            </w:r>
+          </w:p>
+        </w:tc>
+        <w:tc>
+          <w:tcPr>
+            <w:tcW w:w="3000" w:type="dxa"/>
+          </w:tcPr>
+          <w:p>
+            <w:pPr>
+              <w:pStyle w:val="TableText"/>
+            </w:pPr>
+            <w:r>
+              <w:t xml:space="preserve">정기 기획전 평균 806명 대비 하회</w:t>
             </w:r>
           </w:p>
         </w:tc>

</xml_diff>

<commit_message>
Group director metrics into compact paired cards
</commit_message>
<xml_diff>
--- a/output/report-draft.docx
+++ b/output/report-draft.docx
@@ -530,6 +530,170 @@
               <w:pStyle w:val="TableText"/>
             </w:pPr>
             <w:r>
+              <w:t xml:space="preserve">프로그램 참여</w:t>
+            </w:r>
+          </w:p>
+        </w:tc>
+        <w:tc>
+          <w:tcPr>
+            <w:tcW w:w="3000" w:type="dxa"/>
+          </w:tcPr>
+          <w:p>
+            <w:pPr>
+              <w:pStyle w:val="TableText"/>
+            </w:pPr>
+            <w:r>
+              <w:t xml:space="preserve">548명</w:t>
+            </w:r>
+          </w:p>
+        </w:tc>
+        <w:tc>
+          <w:tcPr>
+            <w:tcW w:w="3000" w:type="dxa"/>
+          </w:tcPr>
+          <w:p>
+            <w:pPr>
+              <w:pStyle w:val="TableText"/>
+            </w:pPr>
+            <w:r>
+              <w:t xml:space="preserve">정기 기획전 평균 806명 대비 하회</w:t>
+            </w:r>
+          </w:p>
+        </w:tc>
+      </w:tr>
+      <w:tr>
+        <w:tc>
+          <w:tcPr>
+            <w:tcW w:w="3000" w:type="dxa"/>
+          </w:tcPr>
+          <w:p>
+            <w:pPr>
+              <w:pStyle w:val="TableText"/>
+            </w:pPr>
+            <w:r>
+              <w:t xml:space="preserve">프로그램 참여율</w:t>
+            </w:r>
+          </w:p>
+        </w:tc>
+        <w:tc>
+          <w:tcPr>
+            <w:tcW w:w="3000" w:type="dxa"/>
+          </w:tcPr>
+          <w:p>
+            <w:pPr>
+              <w:pStyle w:val="TableText"/>
+            </w:pPr>
+            <w:r>
+              <w:t xml:space="preserve">3.6%</w:t>
+            </w:r>
+          </w:p>
+        </w:tc>
+        <w:tc>
+          <w:tcPr>
+            <w:tcW w:w="3000" w:type="dxa"/>
+          </w:tcPr>
+          <w:p>
+            <w:pPr>
+              <w:pStyle w:val="TableText"/>
+            </w:pPr>
+            <w:r>
+              <w:t xml:space="preserve">정기 기획전 평균 8.4% 대비 하회</w:t>
+            </w:r>
+          </w:p>
+        </w:tc>
+      </w:tr>
+      <w:tr>
+        <w:tc>
+          <w:tcPr>
+            <w:tcW w:w="3000" w:type="dxa"/>
+          </w:tcPr>
+          <w:p>
+            <w:pPr>
+              <w:pStyle w:val="TableText"/>
+            </w:pPr>
+            <w:r>
+              <w:t xml:space="preserve">보도 건수</w:t>
+            </w:r>
+          </w:p>
+        </w:tc>
+        <w:tc>
+          <w:tcPr>
+            <w:tcW w:w="3000" w:type="dxa"/>
+          </w:tcPr>
+          <w:p>
+            <w:pPr>
+              <w:pStyle w:val="TableText"/>
+            </w:pPr>
+            <w:r>
+              <w:t xml:space="preserve">32건</w:t>
+            </w:r>
+          </w:p>
+        </w:tc>
+        <w:tc>
+          <w:tcPr>
+            <w:tcW w:w="3000" w:type="dxa"/>
+          </w:tcPr>
+          <w:p>
+            <w:pPr>
+              <w:pStyle w:val="TableText"/>
+            </w:pPr>
+            <w:r>
+              <w:t xml:space="preserve">정기 기획전 평균 29건 대비 상회</w:t>
+            </w:r>
+          </w:p>
+        </w:tc>
+      </w:tr>
+      <w:tr>
+        <w:tc>
+          <w:tcPr>
+            <w:tcW w:w="3000" w:type="dxa"/>
+          </w:tcPr>
+          <w:p>
+            <w:pPr>
+              <w:pStyle w:val="TableText"/>
+            </w:pPr>
+            <w:r>
+              <w:t xml:space="preserve">SNS 피드백</w:t>
+            </w:r>
+          </w:p>
+        </w:tc>
+        <w:tc>
+          <w:tcPr>
+            <w:tcW w:w="3000" w:type="dxa"/>
+          </w:tcPr>
+          <w:p>
+            <w:pPr>
+              <w:pStyle w:val="TableText"/>
+            </w:pPr>
+            <w:r>
+              <w:t xml:space="preserve">2건</w:t>
+            </w:r>
+          </w:p>
+        </w:tc>
+        <w:tc>
+          <w:tcPr>
+            <w:tcW w:w="3000" w:type="dxa"/>
+          </w:tcPr>
+          <w:p>
+            <w:pPr>
+              <w:pStyle w:val="TableText"/>
+            </w:pPr>
+            <w:r>
+              <w:t xml:space="preserve">선별 입력 SNS 후기 수</w:t>
+            </w:r>
+          </w:p>
+        </w:tc>
+      </w:tr>
+      <w:tr>
+        <w:tc>
+          <w:tcPr>
+            <w:tcW w:w="3000" w:type="dxa"/>
+          </w:tcPr>
+          <w:p>
+            <w:pPr>
+              <w:pStyle w:val="TableText"/>
+            </w:pPr>
+            <w:r>
               <w:t xml:space="preserve">관객당 비용</w:t>
             </w:r>
           </w:p>
@@ -571,33 +735,33 @@
               <w:pStyle w:val="TableText"/>
             </w:pPr>
             <w:r>
-              <w:t xml:space="preserve">프로그램 참여 인원</w:t>
-            </w:r>
-          </w:p>
-        </w:tc>
-        <w:tc>
-          <w:tcPr>
-            <w:tcW w:w="3000" w:type="dxa"/>
-          </w:tcPr>
-          <w:p>
-            <w:pPr>
-              <w:pStyle w:val="TableText"/>
-            </w:pPr>
-            <w:r>
-              <w:t xml:space="preserve">548명</w:t>
-            </w:r>
-          </w:p>
-        </w:tc>
-        <w:tc>
-          <w:tcPr>
-            <w:tcW w:w="3000" w:type="dxa"/>
-          </w:tcPr>
-          <w:p>
-            <w:pPr>
-              <w:pStyle w:val="TableText"/>
-            </w:pPr>
-            <w:r>
-              <w:t xml:space="preserve">정기 기획전 평균 806명 대비 하회</w:t>
+              <w:t xml:space="preserve">유료 관객 비율</w:t>
+            </w:r>
+          </w:p>
+        </w:tc>
+        <w:tc>
+          <w:tcPr>
+            <w:tcW w:w="3000" w:type="dxa"/>
+          </w:tcPr>
+          <w:p>
+            <w:pPr>
+              <w:pStyle w:val="TableText"/>
+            </w:pPr>
+            <w:r>
+              <w:t xml:space="preserve">58.6%</w:t>
+            </w:r>
+          </w:p>
+        </w:tc>
+        <w:tc>
+          <w:tcPr>
+            <w:tcW w:w="3000" w:type="dxa"/>
+          </w:tcPr>
+          <w:p>
+            <w:pPr>
+              <w:pStyle w:val="TableText"/>
+            </w:pPr>
+            <w:r>
+              <w:t xml:space="preserve">정기 기획전 평균 86.2% 대비 하회</w:t>
             </w:r>
           </w:p>
         </w:tc>

</xml_diff>

<commit_message>
Fix director metric card inputs
</commit_message>
<xml_diff>
--- a/output/report-draft.docx
+++ b/output/report-draft.docx
@@ -489,6 +489,47 @@
               <w:pStyle w:val="TableText"/>
             </w:pPr>
             <w:r>
+              <w:t xml:space="preserve">예산 집행률</w:t>
+            </w:r>
+          </w:p>
+        </w:tc>
+        <w:tc>
+          <w:tcPr>
+            <w:tcW w:w="3000" w:type="dxa"/>
+          </w:tcPr>
+          <w:p>
+            <w:pPr>
+              <w:pStyle w:val="TableText"/>
+            </w:pPr>
+            <w:r>
+              <w:t xml:space="preserve">92.4%</w:t>
+            </w:r>
+          </w:p>
+        </w:tc>
+        <w:tc>
+          <w:tcPr>
+            <w:tcW w:w="3000" w:type="dxa"/>
+          </w:tcPr>
+          <w:p>
+            <w:pPr>
+              <w:pStyle w:val="TableText"/>
+            </w:pPr>
+            <w:r>
+              <w:t xml:space="preserve">엑셀 입력 예산 집행률</w:t>
+            </w:r>
+          </w:p>
+        </w:tc>
+      </w:tr>
+      <w:tr>
+        <w:tc>
+          <w:tcPr>
+            <w:tcW w:w="3000" w:type="dxa"/>
+          </w:tcPr>
+          <w:p>
+            <w:pPr>
+              <w:pStyle w:val="TableText"/>
+            </w:pPr>
+            <w:r>
               <w:t xml:space="preserve">총 수입</w:t>
             </w:r>
           </w:p>
@@ -530,7 +571,171 @@
               <w:pStyle w:val="TableText"/>
             </w:pPr>
             <w:r>
-              <w:t xml:space="preserve">프로그램 참여</w:t>
+              <w:t xml:space="preserve">관객당 비용</w:t>
+            </w:r>
+          </w:p>
+        </w:tc>
+        <w:tc>
+          <w:tcPr>
+            <w:tcW w:w="3000" w:type="dxa"/>
+          </w:tcPr>
+          <w:p>
+            <w:pPr>
+              <w:pStyle w:val="TableText"/>
+            </w:pPr>
+            <w:r>
+              <w:t xml:space="preserve">13,816원/명</w:t>
+            </w:r>
+          </w:p>
+        </w:tc>
+        <w:tc>
+          <w:tcPr>
+            <w:tcW w:w="3000" w:type="dxa"/>
+          </w:tcPr>
+          <w:p>
+            <w:pPr>
+              <w:pStyle w:val="TableText"/>
+            </w:pPr>
+            <w:r>
+              <w:t xml:space="preserve">총 사용 예산 / 총 관객 수; 정기 기획전 평균 14,719원/명 대비 하회</w:t>
+            </w:r>
+          </w:p>
+        </w:tc>
+      </w:tr>
+      <w:tr>
+        <w:tc>
+          <w:tcPr>
+            <w:tcW w:w="3000" w:type="dxa"/>
+          </w:tcPr>
+          <w:p>
+            <w:pPr>
+              <w:pStyle w:val="TableText"/>
+            </w:pPr>
+            <w:r>
+              <w:t xml:space="preserve">유료 관객 비율</w:t>
+            </w:r>
+          </w:p>
+        </w:tc>
+        <w:tc>
+          <w:tcPr>
+            <w:tcW w:w="3000" w:type="dxa"/>
+          </w:tcPr>
+          <w:p>
+            <w:pPr>
+              <w:pStyle w:val="TableText"/>
+            </w:pPr>
+            <w:r>
+              <w:t xml:space="preserve">58.6%</w:t>
+            </w:r>
+          </w:p>
+        </w:tc>
+        <w:tc>
+          <w:tcPr>
+            <w:tcW w:w="3000" w:type="dxa"/>
+          </w:tcPr>
+          <w:p>
+            <w:pPr>
+              <w:pStyle w:val="TableText"/>
+            </w:pPr>
+            <w:r>
+              <w:t xml:space="preserve">정기 기획전 평균 86.2% 대비 하회</w:t>
+            </w:r>
+          </w:p>
+        </w:tc>
+      </w:tr>
+      <w:tr>
+        <w:tc>
+          <w:tcPr>
+            <w:tcW w:w="3000" w:type="dxa"/>
+          </w:tcPr>
+          <w:p>
+            <w:pPr>
+              <w:pStyle w:val="TableText"/>
+            </w:pPr>
+            <w:r>
+              <w:t xml:space="preserve">단체 관객 비율</w:t>
+            </w:r>
+          </w:p>
+        </w:tc>
+        <w:tc>
+          <w:tcPr>
+            <w:tcW w:w="3000" w:type="dxa"/>
+          </w:tcPr>
+          <w:p>
+            <w:pPr>
+              <w:pStyle w:val="TableText"/>
+            </w:pPr>
+            <w:r>
+              <w:t xml:space="preserve">8%</w:t>
+            </w:r>
+          </w:p>
+        </w:tc>
+        <w:tc>
+          <w:tcPr>
+            <w:tcW w:w="3000" w:type="dxa"/>
+          </w:tcPr>
+          <w:p>
+            <w:pPr>
+              <w:pStyle w:val="TableText"/>
+            </w:pPr>
+            <w:r>
+              <w:t xml:space="preserve">단체 관객 수 / 총 관객 수</w:t>
+            </w:r>
+          </w:p>
+        </w:tc>
+      </w:tr>
+      <w:tr>
+        <w:tc>
+          <w:tcPr>
+            <w:tcW w:w="3000" w:type="dxa"/>
+          </w:tcPr>
+          <w:p>
+            <w:pPr>
+              <w:pStyle w:val="TableText"/>
+            </w:pPr>
+            <w:r>
+              <w:t xml:space="preserve">프로그램 회수</w:t>
+            </w:r>
+          </w:p>
+        </w:tc>
+        <w:tc>
+          <w:tcPr>
+            <w:tcW w:w="3000" w:type="dxa"/>
+          </w:tcPr>
+          <w:p>
+            <w:pPr>
+              <w:pStyle w:val="TableText"/>
+            </w:pPr>
+            <w:r>
+              <w:t xml:space="preserve">65회</w:t>
+            </w:r>
+          </w:p>
+        </w:tc>
+        <w:tc>
+          <w:tcPr>
+            <w:tcW w:w="3000" w:type="dxa"/>
+          </w:tcPr>
+          <w:p>
+            <w:pPr>
+              <w:pStyle w:val="TableText"/>
+            </w:pPr>
+            <w:r>
+              <w:t xml:space="preserve">프로그램 총 회차</w:t>
+            </w:r>
+          </w:p>
+        </w:tc>
+      </w:tr>
+      <w:tr>
+        <w:tc>
+          <w:tcPr>
+            <w:tcW w:w="3000" w:type="dxa"/>
+          </w:tcPr>
+          <w:p>
+            <w:pPr>
+              <w:pStyle w:val="TableText"/>
+            </w:pPr>
+            <w:r>
+              <w:t xml:space="preserve">프로그램 참여 수</w:t>
             </w:r>
           </w:p>
         </w:tc>
@@ -571,47 +776,6 @@
               <w:pStyle w:val="TableText"/>
             </w:pPr>
             <w:r>
-              <w:t xml:space="preserve">프로그램 참여율</w:t>
-            </w:r>
-          </w:p>
-        </w:tc>
-        <w:tc>
-          <w:tcPr>
-            <w:tcW w:w="3000" w:type="dxa"/>
-          </w:tcPr>
-          <w:p>
-            <w:pPr>
-              <w:pStyle w:val="TableText"/>
-            </w:pPr>
-            <w:r>
-              <w:t xml:space="preserve">3.6%</w:t>
-            </w:r>
-          </w:p>
-        </w:tc>
-        <w:tc>
-          <w:tcPr>
-            <w:tcW w:w="3000" w:type="dxa"/>
-          </w:tcPr>
-          <w:p>
-            <w:pPr>
-              <w:pStyle w:val="TableText"/>
-            </w:pPr>
-            <w:r>
-              <w:t xml:space="preserve">정기 기획전 평균 8.4% 대비 하회</w:t>
-            </w:r>
-          </w:p>
-        </w:tc>
-      </w:tr>
-      <w:tr>
-        <w:tc>
-          <w:tcPr>
-            <w:tcW w:w="3000" w:type="dxa"/>
-          </w:tcPr>
-          <w:p>
-            <w:pPr>
-              <w:pStyle w:val="TableText"/>
-            </w:pPr>
-            <w:r>
               <w:t xml:space="preserve">보도 건수</w:t>
             </w:r>
           </w:p>
@@ -666,102 +830,20 @@
               <w:pStyle w:val="TableText"/>
             </w:pPr>
             <w:r>
-              <w:t xml:space="preserve">2건</w:t>
-            </w:r>
-          </w:p>
-        </w:tc>
-        <w:tc>
-          <w:tcPr>
-            <w:tcW w:w="3000" w:type="dxa"/>
-          </w:tcPr>
-          <w:p>
-            <w:pPr>
-              <w:pStyle w:val="TableText"/>
-            </w:pPr>
-            <w:r>
-              <w:t xml:space="preserve">선별 입력 SNS 후기 수</w:t>
-            </w:r>
-          </w:p>
-        </w:tc>
-      </w:tr>
-      <w:tr>
-        <w:tc>
-          <w:tcPr>
-            <w:tcW w:w="3000" w:type="dxa"/>
-          </w:tcPr>
-          <w:p>
-            <w:pPr>
-              <w:pStyle w:val="TableText"/>
-            </w:pPr>
-            <w:r>
-              <w:t xml:space="preserve">관객당 비용</w:t>
-            </w:r>
-          </w:p>
-        </w:tc>
-        <w:tc>
-          <w:tcPr>
-            <w:tcW w:w="3000" w:type="dxa"/>
-          </w:tcPr>
-          <w:p>
-            <w:pPr>
-              <w:pStyle w:val="TableText"/>
-            </w:pPr>
-            <w:r>
-              <w:t xml:space="preserve">13,816원/명</w:t>
-            </w:r>
-          </w:p>
-        </w:tc>
-        <w:tc>
-          <w:tcPr>
-            <w:tcW w:w="3000" w:type="dxa"/>
-          </w:tcPr>
-          <w:p>
-            <w:pPr>
-              <w:pStyle w:val="TableText"/>
-            </w:pPr>
-            <w:r>
-              <w:t xml:space="preserve">총 사용 예산 / 총 관객 수; 정기 기획전 평균 14,719원/명 대비 하회</w:t>
-            </w:r>
-          </w:p>
-        </w:tc>
-      </w:tr>
-      <w:tr>
-        <w:tc>
-          <w:tcPr>
-            <w:tcW w:w="3000" w:type="dxa"/>
-          </w:tcPr>
-          <w:p>
-            <w:pPr>
-              <w:pStyle w:val="TableText"/>
-            </w:pPr>
-            <w:r>
-              <w:t xml:space="preserve">유료 관객 비율</w:t>
-            </w:r>
-          </w:p>
-        </w:tc>
-        <w:tc>
-          <w:tcPr>
-            <w:tcW w:w="3000" w:type="dxa"/>
-          </w:tcPr>
-          <w:p>
-            <w:pPr>
-              <w:pStyle w:val="TableText"/>
-            </w:pPr>
-            <w:r>
-              <w:t xml:space="preserve">58.6%</w:t>
-            </w:r>
-          </w:p>
-        </w:tc>
-        <w:tc>
-          <w:tcPr>
-            <w:tcW w:w="3000" w:type="dxa"/>
-          </w:tcPr>
-          <w:p>
-            <w:pPr>
-              <w:pStyle w:val="TableText"/>
-            </w:pPr>
-            <w:r>
-              <w:t xml:space="preserve">정기 기획전 평균 86.2% 대비 하회</w:t>
+              <w:t xml:space="preserve">186건</w:t>
+            </w:r>
+          </w:p>
+        </w:tc>
+        <w:tc>
+          <w:tcPr>
+            <w:tcW w:w="3000" w:type="dxa"/>
+          </w:tcPr>
+          <w:p>
+            <w:pPr>
+              <w:pStyle w:val="TableText"/>
+            </w:pPr>
+            <w:r>
+              <w:t xml:space="preserve">엑셀 입력 SNS 피드백 합계</w:t>
             </w:r>
           </w:p>
         </w:tc>

</xml_diff>

<commit_message>
Refine director metric strip comparisons
</commit_message>
<xml_diff>
--- a/output/report-draft.docx
+++ b/output/report-draft.docx
@@ -515,7 +515,7 @@
               <w:pStyle w:val="TableText"/>
             </w:pPr>
             <w:r>
-              <w:t xml:space="preserve">엑셀 입력 예산 집행률</w:t>
+              <w:t xml:space="preserve">정기 기획전 평균 89.7% 대비 상회</w:t>
             </w:r>
           </w:p>
         </w:tc>
@@ -597,7 +597,7 @@
               <w:pStyle w:val="TableText"/>
             </w:pPr>
             <w:r>
-              <w:t xml:space="preserve">총 사용 예산 / 총 관객 수; 정기 기획전 평균 14,719원/명 대비 하회</w:t>
+              <w:t xml:space="preserve">정기 기획전 평균 14,719원/명 대비 하회</w:t>
             </w:r>
           </w:p>
         </w:tc>
@@ -679,7 +679,7 @@
               <w:pStyle w:val="TableText"/>
             </w:pPr>
             <w:r>
-              <w:t xml:space="preserve">단체 관객 수 / 총 관객 수</w:t>
+              <w:t xml:space="preserve">정기 기획전 평균 6.7% 대비 상회</w:t>
             </w:r>
           </w:p>
         </w:tc>
@@ -720,7 +720,7 @@
               <w:pStyle w:val="TableText"/>
             </w:pPr>
             <w:r>
-              <w:t xml:space="preserve">프로그램 총 회차</w:t>
+              <w:t xml:space="preserve">정기 기획전 평균 55회 대비 상회</w:t>
             </w:r>
           </w:p>
         </w:tc>
@@ -843,7 +843,7 @@
               <w:pStyle w:val="TableText"/>
             </w:pPr>
             <w:r>
-              <w:t xml:space="preserve">엑셀 입력 SNS 피드백 합계</w:t>
+              <w:t xml:space="preserve">정기 기획전 평균 126,781건 대비 하회</w:t>
             </w:r>
           </w:p>
         </w:tc>

</xml_diff>

<commit_message>
Tighten metric card formatting
</commit_message>
<xml_diff>
--- a/output/report-draft.docx
+++ b/output/report-draft.docx
@@ -474,7 +474,7 @@
               <w:pStyle w:val="TableText"/>
             </w:pPr>
             <w:r>
-              <w:t xml:space="preserve">정기 기획전 평균 140,000,000원 대비 상회</w:t>
+              <w:t xml:space="preserve">정기 기획전 평균 1.4억 대비 상회</w:t>
             </w:r>
           </w:p>
         </w:tc>
@@ -556,7 +556,7 @@
               <w:pStyle w:val="TableText"/>
             </w:pPr>
             <w:r>
-              <w:t xml:space="preserve">정기 기획전 평균 29,375,000원 대비 상회</w:t>
+              <w:t xml:space="preserve">정기 기획전 평균 0.3억 대비 상회</w:t>
             </w:r>
           </w:p>
         </w:tc>
@@ -830,20 +830,20 @@
               <w:pStyle w:val="TableText"/>
             </w:pPr>
             <w:r>
-              <w:t xml:space="preserve">186건</w:t>
-            </w:r>
-          </w:p>
-        </w:tc>
-        <w:tc>
-          <w:tcPr>
-            <w:tcW w:w="3000" w:type="dxa"/>
-          </w:tcPr>
-          <w:p>
-            <w:pPr>
-              <w:pStyle w:val="TableText"/>
-            </w:pPr>
-            <w:r>
-              <w:t xml:space="preserve">정기 기획전 평균 126,781건 대비 하회</w:t>
+              <w:t xml:space="preserve">186점</w:t>
+            </w:r>
+          </w:p>
+        </w:tc>
+        <w:tc>
+          <w:tcPr>
+            <w:tcW w:w="3000" w:type="dxa"/>
+          </w:tcPr>
+          <w:p>
+            <w:pPr>
+              <w:pStyle w:val="TableText"/>
+            </w:pPr>
+            <w:r>
+              <w:t xml:space="preserve">정기 기획전 평균 126,781점 대비 하회</w:t>
             </w:r>
           </w:p>
         </w:tc>

</xml_diff>

<commit_message>
Add empty upload start state
</commit_message>
<xml_diff>
--- a/output/report-draft.docx
+++ b/output/report-draft.docx
@@ -875,14 +875,6 @@
     </w:p>
     <w:p>
       <w:pPr>
-        <w:pStyle w:val="Caveat"/>
-      </w:pPr>
-      <w:r>
-        <w:t xml:space="preserve">한계: 기존 전시 원자료의 유형 분류와 입력된 수치를 바탕으로 자동 산출한 비교군입니다. 성과 판정이 아니라 수치상 특이점으로 기록합니다.</w:t>
-      </w:r>
-    </w:p>
-    <w:p>
-      <w:pPr>
         <w:pStyle w:val="Bullet"/>
       </w:pPr>
       <w:r>
@@ -891,14 +883,6 @@
     </w:p>
     <w:p>
       <w:pPr>
-        <w:pStyle w:val="Caveat"/>
-      </w:pPr>
-      <w:r>
-        <w:t xml:space="preserve">한계: 초대, 제휴, 패스, 단체 관람 정책의 영향을 함께 확인해야 하며 수입 성과와 단순히 동일시할 수 없습니다.</w:t>
-      </w:r>
-    </w:p>
-    <w:p>
-      <w:pPr>
         <w:pStyle w:val="Bullet"/>
       </w:pPr>
       <w:r>
@@ -907,14 +891,6 @@
     </w:p>
     <w:p>
       <w:pPr>
-        <w:pStyle w:val="Caveat"/>
-      </w:pPr>
-      <w:r>
-        <w:t xml:space="preserve">한계: 프로그램 유형, 정원, 사전예약 방식이 다르면 단순 참여 인원 비교의 의미가 제한됩니다.</w:t>
-      </w:r>
-    </w:p>
-    <w:p>
-      <w:pPr>
         <w:pStyle w:val="Bullet"/>
       </w:pPr>
       <w:r>
@@ -923,14 +899,6 @@
     </w:p>
     <w:p>
       <w:pPr>
-        <w:pStyle w:val="Caveat"/>
-      </w:pPr>
-      <w:r>
-        <w:t xml:space="preserve">한계: 아래 반응은 전체 관객 의견의 통계적 표본이 아니라 보고서 작성자가 선별 입력한 후기입니다.</w:t>
-      </w:r>
-    </w:p>
-    <w:p>
-      <w:pPr>
         <w:pStyle w:val="Bullet"/>
       </w:pPr>
       <w:r>
@@ -939,14 +907,6 @@
     </w:p>
     <w:p>
       <w:pPr>
-        <w:pStyle w:val="Caveat"/>
-      </w:pPr>
-      <w:r>
-        <w:t xml:space="preserve">한계: 관객당 비용은 예산 총액과 관객 수만 반영하므로 전시의 질적 완성도나 제작 난이도를 직접 평가하지 않습니다.</w:t>
-      </w:r>
-    </w:p>
-    <w:p>
-      <w:pPr>
         <w:pStyle w:val="Heading1"/>
       </w:pPr>
       <w:r>
@@ -987,14 +947,6 @@
     </w:p>
     <w:p>
       <w:pPr>
-        <w:pStyle w:val="Caveat"/>
-      </w:pPr>
-      <w:r>
-        <w:t xml:space="preserve">한계: 프로그램 유형, 정원, 사전예약 방식이 다르면 단순 참여 인원 비교의 의미가 제한됩니다.</w:t>
-      </w:r>
-    </w:p>
-    <w:p>
-      <w:pPr>
         <w:pStyle w:val="EvidenceLabel"/>
       </w:pPr>
       <w:r>
@@ -1059,14 +1011,6 @@
     </w:p>
     <w:p>
       <w:pPr>
-        <w:pStyle w:val="Caveat"/>
-      </w:pPr>
-      <w:r>
-        <w:t xml:space="preserve">한계: 기존 전시 원자료의 유형 분류와 입력된 수치를 바탕으로 자동 산출한 비교군입니다. 성과 판정이 아니라 수치상 특이점으로 기록합니다.</w:t>
-      </w:r>
-    </w:p>
-    <w:p>
-      <w:pPr>
         <w:pStyle w:val="EvidenceLabel"/>
       </w:pPr>
       <w:r>
@@ -1131,14 +1075,6 @@
     </w:p>
     <w:p>
       <w:pPr>
-        <w:pStyle w:val="Caveat"/>
-      </w:pPr>
-      <w:r>
-        <w:t xml:space="preserve">한계: 관객당 비용은 예산 총액과 관객 수만 반영하므로 전시의 질적 완성도나 제작 난이도를 직접 평가하지 않습니다.</w:t>
-      </w:r>
-    </w:p>
-    <w:p>
-      <w:pPr>
         <w:pStyle w:val="EvidenceLabel"/>
       </w:pPr>
       <w:r>
@@ -1195,14 +1131,6 @@
     </w:p>
     <w:p>
       <w:pPr>
-        <w:pStyle w:val="Caveat"/>
-      </w:pPr>
-      <w:r>
-        <w:t xml:space="preserve">한계: 초대, 제휴, 패스, 단체 관람 정책의 영향을 함께 확인해야 하며 수입 성과와 단순히 동일시할 수 없습니다.</w:t>
-      </w:r>
-    </w:p>
-    <w:p>
-      <w:pPr>
         <w:pStyle w:val="EvidenceLabel"/>
       </w:pPr>
       <w:r>
@@ -1267,14 +1195,6 @@
     </w:p>
     <w:p>
       <w:pPr>
-        <w:pStyle w:val="Caveat"/>
-      </w:pPr>
-      <w:r>
-        <w:t xml:space="preserve">한계: 언론 보도 건수와 SNS 게시 수만으로 관객 유입의 인과관계를 확정할 수 없습니다.</w:t>
-      </w:r>
-    </w:p>
-    <w:p>
-      <w:pPr>
         <w:pStyle w:val="EvidenceLabel"/>
       </w:pPr>
       <w:r>
@@ -1339,14 +1259,6 @@
     </w:p>
     <w:p>
       <w:pPr>
-        <w:pStyle w:val="Caveat"/>
-      </w:pPr>
-      <w:r>
-        <w:t xml:space="preserve">한계: 아래 반응은 전체 관객 의견의 통계적 표본이 아니라 보고서 작성자가 선별 입력한 후기입니다.</w:t>
-      </w:r>
-    </w:p>
-    <w:p>
-      <w:pPr>
         <w:pStyle w:val="EvidenceLabel"/>
       </w:pPr>
       <w:r>
@@ -1383,14 +1295,6 @@
       </w:pPr>
       <w:r>
         <w:t xml:space="preserve">선별된 부정 및 건의 반응에서는 혼잡도와 감상 동선에 관한 의견이 확인됨.</w:t>
-      </w:r>
-    </w:p>
-    <w:p>
-      <w:pPr>
-        <w:pStyle w:val="Caveat"/>
-      </w:pPr>
-      <w:r>
-        <w:t xml:space="preserve">한계: 아래 반응은 전체 관객 의견의 통계적 표본이 아니라 보고서 작성자가 선별 입력한 후기입니다.</w:t>
       </w:r>
     </w:p>
     <w:p>

</xml_diff>

<commit_message>
Keep data quality out of reports
</commit_message>
<xml_diff>
--- a/output/report-draft.docx
+++ b/output/report-draft.docx
@@ -80,14 +80,6 @@
       </w:pPr>
       <w:r>
         <w:t xml:space="preserve">V. 관객 반응 기록</w:t>
-      </w:r>
-    </w:p>
-    <w:p>
-      <w:pPr>
-        <w:pStyle w:val="TocLine"/>
-      </w:pPr>
-      <w:r>
-        <w:t xml:space="preserve">VI. 데이터 검증 및 후속 참고</w:t>
       </w:r>
     </w:p>
     <w:p>
@@ -1319,54 +1311,6 @@
       </w:pPr>
       <w:r>
         <w:t xml:space="preserve">• 설문 인용: 사전예약제가 필요해 보입니다.</w:t>
-      </w:r>
-    </w:p>
-    <w:p>
-      <w:pPr>
-        <w:pStyle w:val="Heading1"/>
-      </w:pPr>
-      <w:r>
-        <w:t xml:space="preserve">VI. 데이터 검증 및 후속 참고</w:t>
-      </w:r>
-    </w:p>
-    <w:p>
-      <w:pPr>
-        <w:pStyle w:val="BodyText"/>
-      </w:pPr>
-      <w:r>
-        <w:t xml:space="preserve">평가 및 개선방안 항목은 성공/실패 판정이 아니라 수치상 특이점</w:t>
-      </w:r>
-    </w:p>
-    <w:p>
-      <w:pPr>
-        <w:pStyle w:val="Bullet"/>
-      </w:pPr>
-      <w:r>
-        <w:t xml:space="preserve">• 데이터 검증 필요: 본문 내 프로그램 수와 표의 프로그램 수가 일치하지 않을 가능성이 있음</w:t>
-      </w:r>
-    </w:p>
-    <w:p>
-      <w:pPr>
-        <w:pStyle w:val="Caveat"/>
-      </w:pPr>
-      <w:r>
-        <w:t xml:space="preserve">확인 필요: 자동 보고서 생성 전 검수자가 원자료의 프로그램 총수·회차·참여 인원을 확인해야 합니다.</w:t>
-      </w:r>
-    </w:p>
-    <w:p>
-      <w:pPr>
-        <w:pStyle w:val="Evidence"/>
-      </w:pPr>
-      <w:r>
-        <w:t xml:space="preserve">• 개요 표기: 총 8개(65회) 프로그램 진행·548명 참여</w:t>
-      </w:r>
-    </w:p>
-    <w:p>
-      <w:pPr>
-        <w:pStyle w:val="Evidence"/>
-      </w:pPr>
-      <w:r>
-        <w:t xml:space="preserve">• 전시 구성 표기: 총 7개 프로그램 진행·453명 참여</w:t>
       </w:r>
     </w:p>
     <w:p>

</xml_diff>